<commit_message>
Record verified evidence from Jenkins build #21 and sync the answer sheet
Doc-only commit, no application or pipeline code changed since the
previous commit (174be0e), which is the tested source. Jenkins build
#21 ran against that exact commit on this repository: all 7 stages
passed, 78/78 tests (98% coverage), pylint 9.96/10, security gate
passed (0 Bandit findings, 9/9 dependencies clean), 5/5 smoke tests on
both staging and production, and the full Monitoring alert path
(firing and resolved) verified within the run itself.

- README: filled in the "Tested Jenkins build" citation with this
  evidence.
- Answer sheet (DOCX+PDF): real Stage View screenshot from build #21,
  matching build/commit/version citations throughout, and the
  REST-API-vs-dashboard description corrected (API does CRUD, the
  dashboard only lists and filters).
- .gitignore: excluded video-script.md, a personal recording aid kept
  locally, not part of the submitted deliverable.
</commit_message>
<xml_diff>
--- a/SIT223-7.3HD-AnswerSheet.docx
+++ b/SIT223-7.3HD-AnswerSheet.docx
@@ -121,7 +121,7 @@
           </w:p>
           <w:p>
             <w:r>
-              <w:t>https://github.com/8ccs/sit223-7.3hd-incident-tracker</w:t>
+              <w:t>https://github.com/8ccs/sit223-7.3hd-incident-tracker-new2</w:t>
             </w:r>
           </w:p>
           <w:p>
@@ -198,7 +198,7 @@
               <w:jc w:val="both"/>
             </w:pPr>
             <w:r>
-              <w:t>It provides a REST API and a server-rendered dashboard for creating, listing, filtering, updating, and deleting incidents. Each incident has a title, description, severity (low/medium/high/critical), and status (open/in_progress/resolved/closed). A business rule blocks deletion of any incident that is still open or in progress.</w:t>
+              <w:t>It provides a REST API for creating, reading, updating, and deleting incidents, plus status/severity filtering and free-text search, and a separate server-rendered dashboard that lists and filters incidents (the dashboard itself only displays and filters -- create/update/delete go through the API). Each incident has a title, description, severity (low/medium/high/critical), and status (open/in_progress/resolved/closed). A business rule blocks deletion of any incident that is still open or in progress.</w:t>
             </w:r>
           </w:p>
           <w:p>
@@ -325,7 +325,7 @@
               <w:spacing w:before="2" w:line="291" w:lineRule="exact"/>
             </w:pPr>
             <w:r>
-              <w:t>Jenkins Stage View, build #19, commit 4323a72 -- all 7 required stages (Build, Test, Code Quality, Security, Deploy, Release, Monitoring) passed. Version 1.0.0+build.19.4323a72 is live in production:</w:t>
+              <w:t>Jenkins Stage View, build #21, commit 174be0e -- all 7 required stages (Build, Test, Code Quality, Security, Deploy, Release, Monitoring) passed. Version 1.0.0+build.21.174be0e is live in production:</w:t>
             </w:r>
           </w:p>
           <w:p>
@@ -351,7 +351,7 @@
                     <a:graphicData uri="http://schemas.openxmlformats.org/drawingml/2006/picture">
                       <pic:pic>
                         <pic:nvPicPr>
-                          <pic:cNvPr id="0" name="jenkins-pipeline-build19.jpg"/>
+                          <pic:cNvPr id="0" name="jenkins-pipeline-new2.jpg"/>
                           <pic:cNvPicPr/>
                         </pic:nvPicPr>
                         <pic:blipFill>
@@ -445,7 +445,7 @@
               </w:rPr>
             </w:pPr>
             <w:r>
-              <w:t>Jenkins runs scripts/package_artifact.ps1, which packages the app into a zip artifact and stamps its filename with the Git commit hash and the Jenkins build number (for example, incident-tracker-1.0.0+build.19.4323a72.zip). The artifact is archived by Jenkins and also copied to a shared artifact store, so every later stage uses the exact same file. The pipeline is triggered automatically by SCM polling every 5 minutes, because this local Jenkins has no public URL for a GitHub webhook to reach.</w:t>
+              <w:t>Jenkins runs scripts/package_artifact.ps1, which packages the app into a zip artifact and stamps its filename with the Git commit hash and the Jenkins build number (this run: incident-tracker-1.0.0+build.21.174be0e.zip). The artifact is archived by Jenkins and also copied to a shared artifact store, so every later stage uses the exact same file. The pipeline is triggered automatically by SCM polling every 5 minutes, because this local Jenkins has no public URL for a GitHub webhook to reach.</w:t>
             </w:r>
           </w:p>
           <w:p>
@@ -536,7 +536,7 @@
               </w:rPr>
             </w:pPr>
             <w:r>
-              <w:t>Bandit scans the code for common vulnerability patterns, and pip-audit checks all 9 runtime dependencies against known CVEs (currently zero found). Two real Bandit findings were fixed during development: B104 (binding to all network interfaces) and one of two B608 (dynamic SQL) findings, rewritten to use fixed query text. The second B608 finding, in the incident-update query, is a genuine dynamic column list needed for partial updates; it is mitigated with a fixed five-field allow-list checked in code before the query runs, values are always sent as parameters, and the suppression is documented, not silent. scripts/security_gate.py fails the build on any unresolved finding, and also fails if a scan does not actually complete (this was a real bug in the gate itself, found and fixed during this review). The full findings table is in README.md section 7.1.</w:t>
+              <w:t>Bandit scans the code for common vulnerability patterns, and pip-audit checks all 9 runtime dependencies against known CVEs (currently zero found). scripts/security_gate.py blocks the build on any Bandit finding at HIGH severity with MEDIUM-or-higher confidence, and on any dependency vulnerability that has an available fixed version; it also fails if a scan report is missing, malformed, or reflects a scan that never actually completed, rather than only checking for findings (a real bug in the gate itself, found and fixed during this review). Two real Bandit findings were fixed during development -- B104 (binding to all network interfaces) and one of two B608 (dynamic SQL) findings, rewritten to use fixed query text -- though both are MEDIUM severity in Bandit's own classification, below this gate's HIGH-only blocking threshold either way. The second B608 finding, in the incident-update query, is also MEDIUM severity and is additionally mitigated: it needs a dynamic column list for partial updates, restricted to a fixed five-field allow-list checked in code before the query runs, with every value still sent as a parameter, never concatenated. The full findings table is in README.md section 7.1.</w:t>
             </w:r>
           </w:p>
           <w:p>

</xml_diff>